<commit_message>
Update participant front pages
</commit_message>
<xml_diff>
--- a/authoritative-materials/The_Creative_Leadership_Baseline_View_Front_Pages_V5_Final.docx
+++ b/authoritative-materials/The_Creative_Leadership_Baseline_View_Front_Pages_V5_Final.docx
@@ -5,14 +5,8 @@
     <w:p>
       <w:pPr>
         <w:pStyle w:val="CLTPNote"/>
-        <w:spacing w:after="120"/>
-      </w:pPr>
-      <w:r>
-        <w:rPr>
-          <w:b/>
-        </w:rPr>
-        <w:t>TEAM MEMBER VERSION</w:t>
-      </w:r>
+        <w:spacing w:after="0"/>
+      </w:pPr>
     </w:p>
     <w:p>
       <w:pPr>
@@ -28,12 +22,20 @@
     </w:p>
     <w:p>
       <w:pPr>
-        <w:spacing w:after="0"/>
-        <w:rPr>
-          <w:rFonts w:ascii="Arial Nova Light" w:hAnsi="Arial Nova Light"/>
-          <w:color w:val="000000" w:themeColor="text1"/>
-        </w:rPr>
-      </w:pPr>
+        <w:spacing w:after="200"/>
+        <w:rPr>
+          <w:rFonts w:ascii="Arial Nova Light" w:hAnsi="Arial Nova Light"/>
+          <w:color w:val="000000" w:themeColor="text1"/>
+        </w:rPr>
+      </w:pPr>
+      <w:r>
+        <w:rPr>
+          <w:rFonts w:ascii="Arial Nova Light" w:hAnsi="Arial Nova Light"/>
+          <w:color w:val="5C6B70"/>
+          <w:sz w:val="20"/>
+        </w:rPr>
+        <w:t>For [company] — [team].</w:t>
+      </w:r>
     </w:p>
     <w:p>
       <w:pPr>
@@ -635,22 +637,27 @@
         <w:t>Ellen</w:t>
       </w:r>
     </w:p>
-    <w:p/>
     <w:p>
       <w:pPr>
-        <w:pStyle w:val="CLTPNote"/>
-        <w:spacing w:after="120"/>
-      </w:pPr>
-      <w:r>
-        <w:rPr>
-          <w:b/>
-        </w:rPr>
-        <w:lastRenderedPageBreak/>
-        <w:t>TEAM LEADER VERSION</w:t>
+        <w:spacing w:before="160" w:after="0"/>
+      </w:pPr>
+      <w:r>
+        <w:rPr>
+          <w:rFonts w:ascii="Arial Nova Light" w:hAnsi="Arial Nova Light"/>
+          <w:color w:val="7B8588"/>
+          <w:sz w:val="15"/>
+        </w:rPr>
+        <w:t>(c) Sept 2026 Ellen D Coomber Ltd and Beyond Knowing Ltd.</w:t>
       </w:r>
     </w:p>
     <w:p>
       <w:pPr>
+        <w:pStyle w:val="CLTPNote"/>
+        <w:spacing w:after="0"/>
+      </w:pPr>
+    </w:p>
+    <w:p>
+      <w:pPr>
         <w:pStyle w:val="CLTPTitle"/>
         <w:spacing w:after="160"/>
       </w:pPr>
@@ -660,12 +667,20 @@
     </w:p>
     <w:p>
       <w:pPr>
-        <w:spacing w:after="0"/>
-        <w:rPr>
-          <w:rFonts w:ascii="Arial Nova Light" w:hAnsi="Arial Nova Light"/>
-          <w:color w:val="000000" w:themeColor="text1"/>
-        </w:rPr>
-      </w:pPr>
+        <w:spacing w:after="200"/>
+        <w:rPr>
+          <w:rFonts w:ascii="Arial Nova Light" w:hAnsi="Arial Nova Light"/>
+          <w:color w:val="000000" w:themeColor="text1"/>
+        </w:rPr>
+      </w:pPr>
+      <w:r>
+        <w:rPr>
+          <w:rFonts w:ascii="Arial Nova Light" w:hAnsi="Arial Nova Light"/>
+          <w:color w:val="5C6B70"/>
+          <w:sz w:val="20"/>
+        </w:rPr>
+        <w:t>For [company] — [team].</w:t>
+      </w:r>
     </w:p>
     <w:p>
       <w:pPr>
@@ -1258,35 +1273,26 @@
     </w:p>
     <w:p>
       <w:pPr>
-        <w:rPr>
-          <w:rFonts w:ascii="Arial Nova Light" w:hAnsi="Arial Nova Light"/>
-          <w:color w:val="000000" w:themeColor="text1"/>
-        </w:rPr>
-      </w:pPr>
+        <w:spacing w:before="160" w:after="0"/>
+        <w:rPr>
+          <w:rFonts w:ascii="Arial Nova Light" w:hAnsi="Arial Nova Light"/>
+          <w:color w:val="000000" w:themeColor="text1"/>
+        </w:rPr>
+      </w:pPr>
+      <w:r>
+        <w:rPr>
+          <w:rFonts w:ascii="Arial Nova Light" w:hAnsi="Arial Nova Light"/>
+          <w:color w:val="7B8588"/>
+          <w:sz w:val="15"/>
+        </w:rPr>
+        <w:t>(c) Sept 2026 Ellen D Coomber Ltd and Beyond Knowing Ltd.</w:t>
+      </w:r>
     </w:p>
     <w:p>
       <w:pPr>
         <w:pStyle w:val="CLTPNote"/>
-        <w:spacing w:after="120"/>
-      </w:pPr>
-      <w:r>
-        <w:rPr>
-          <w:b/>
-        </w:rPr>
-        <w:t xml:space="preserve">TEAM </w:t>
-      </w:r>
-      <w:r>
-        <w:rPr>
-          <w:b/>
-        </w:rPr>
-        <w:t>OBSERVER</w:t>
-      </w:r>
-      <w:r>
-        <w:rPr>
-          <w:b/>
-        </w:rPr>
-        <w:t xml:space="preserve"> VERSION</w:t>
-      </w:r>
+        <w:spacing w:after="0"/>
+      </w:pPr>
     </w:p>
     <w:p>
       <w:pPr>
@@ -1299,12 +1305,20 @@
     </w:p>
     <w:p>
       <w:pPr>
-        <w:spacing w:after="0"/>
-        <w:rPr>
-          <w:rFonts w:ascii="Arial Nova Light" w:hAnsi="Arial Nova Light"/>
-          <w:color w:val="000000" w:themeColor="text1"/>
-        </w:rPr>
-      </w:pPr>
+        <w:spacing w:after="200"/>
+        <w:rPr>
+          <w:rFonts w:ascii="Arial Nova Light" w:hAnsi="Arial Nova Light"/>
+          <w:color w:val="000000" w:themeColor="text1"/>
+        </w:rPr>
+      </w:pPr>
+      <w:r>
+        <w:rPr>
+          <w:rFonts w:ascii="Arial Nova Light" w:hAnsi="Arial Nova Light"/>
+          <w:color w:val="5C6B70"/>
+          <w:sz w:val="20"/>
+        </w:rPr>
+        <w:t>For [company] — [team].</w:t>
+      </w:r>
     </w:p>
     <w:p>
       <w:pPr>
@@ -1461,67 +1475,7 @@
         </w:rPr>
       </w:pPr>
       <w:r>
-        <w:rPr>
-          <w:rFonts w:ascii="Arial Nova Light" w:hAnsi="Arial Nova Light"/>
-          <w:color w:val="000000" w:themeColor="text1"/>
-        </w:rPr>
-        <w:t xml:space="preserve">Your responses are confidential. Expanding Possibilities </w:t>
-      </w:r>
-      <w:r>
-        <w:rPr>
-          <w:rFonts w:ascii="Arial Nova Light" w:hAnsi="Arial Nova Light"/>
-          <w:color w:val="000000" w:themeColor="text1"/>
-        </w:rPr>
-        <w:t>may</w:t>
-      </w:r>
-      <w:r>
-        <w:rPr>
-          <w:rFonts w:ascii="Arial Nova Light" w:hAnsi="Arial Nova Light"/>
-          <w:color w:val="000000" w:themeColor="text1"/>
-        </w:rPr>
-        <w:t xml:space="preserve"> be able to identify your responses as</w:t>
-      </w:r>
-      <w:r>
-        <w:rPr>
-          <w:rFonts w:ascii="Arial Nova Light" w:hAnsi="Arial Nova Light"/>
-          <w:color w:val="000000" w:themeColor="text1"/>
-        </w:rPr>
-        <w:t xml:space="preserve"> part of </w:t>
-      </w:r>
-      <w:r>
-        <w:rPr>
-          <w:rFonts w:ascii="Arial Nova Light" w:hAnsi="Arial Nova Light"/>
-          <w:color w:val="000000" w:themeColor="text1"/>
-        </w:rPr>
-        <w:t xml:space="preserve">the </w:t>
-      </w:r>
-      <w:r>
-        <w:rPr>
-          <w:rFonts w:ascii="Arial Nova Light" w:hAnsi="Arial Nova Light"/>
-          <w:color w:val="000000" w:themeColor="text1"/>
-        </w:rPr>
-        <w:t xml:space="preserve">extended </w:t>
-      </w:r>
-      <w:r>
-        <w:rPr>
-          <w:rFonts w:ascii="Arial Nova Light" w:hAnsi="Arial Nova Light"/>
-          <w:color w:val="000000" w:themeColor="text1"/>
-        </w:rPr>
-        <w:t xml:space="preserve">team </w:t>
-      </w:r>
-      <w:r>
-        <w:rPr>
-          <w:rFonts w:ascii="Arial Nova Light" w:hAnsi="Arial Nova Light"/>
-          <w:color w:val="000000" w:themeColor="text1"/>
-        </w:rPr>
-        <w:t>at the offsite</w:t>
-      </w:r>
-      <w:r>
-        <w:rPr>
-          <w:rFonts w:ascii="Arial Nova Light" w:hAnsi="Arial Nova Light"/>
-          <w:color w:val="000000" w:themeColor="text1"/>
-        </w:rPr>
-        <w:t>, but your individual answers will not be shared with anyone else or reported to the team.</w:t>
+        <w:t>Your responses are anonymous. Your name is not associated with your answers, so neither your team, your leader nor Expanding Possibilities can identify who gave any individual response.</w:t>
       </w:r>
     </w:p>
     <w:p>
@@ -1873,11 +1827,20 @@
     </w:p>
     <w:p>
       <w:pPr>
-        <w:rPr>
-          <w:rFonts w:ascii="Arial Nova Light" w:hAnsi="Arial Nova Light"/>
-          <w:color w:val="000000" w:themeColor="text1"/>
-        </w:rPr>
-      </w:pPr>
+        <w:spacing w:before="160" w:after="0"/>
+        <w:rPr>
+          <w:rFonts w:ascii="Arial Nova Light" w:hAnsi="Arial Nova Light"/>
+          <w:color w:val="000000" w:themeColor="text1"/>
+        </w:rPr>
+      </w:pPr>
+      <w:r>
+        <w:rPr>
+          <w:rFonts w:ascii="Arial Nova Light" w:hAnsi="Arial Nova Light"/>
+          <w:color w:val="7B8588"/>
+          <w:sz w:val="15"/>
+        </w:rPr>
+        <w:t>(c) Sept 2026 Ellen D Coomber Ltd and Beyond Knowing Ltd.</w:t>
+      </w:r>
     </w:p>
     <w:sectPr>
       <w:pgSz w:w="12240" w:h="15840"/>

</xml_diff>